<commit_message>
Tambah peminjaman & pengembalian, rincian kondisi per jumlah, dan data master lokasi (saran pembina); perbarui semua dokumen
</commit_message>
<xml_diff>
--- a/dokumen/04_DAFTAR_AKUN.docx
+++ b/dokumen/04_DAFTAR_AKUN.docx
@@ -238,7 +238,6 @@
     <w:p>
       <w:pPr>
         <w:pStyle w:val="Heading1"/>
-        <w:keepNext/>
       </w:pPr>
       <w:r>
         <w:t xml:space="preserve">1. Akun Login Aplikasi</w:t>
@@ -609,7 +608,7 @@
                 <w:sz w:val="19"/>
                 <w:szCs w:val="19"/>
               </w:rPr>
-              <w:t xml:space="preserve">Mengelola pengguna, kategori, data barang; mengoreksi barang masuk</w:t>
+              <w:t xml:space="preserve">Mengelola pengguna, kategori, lokasi, data barang; mengoreksi barang masuk</w:t>
             </w:r>
           </w:p>
         </w:tc>
@@ -774,7 +773,7 @@
                 <w:sz w:val="19"/>
                 <w:szCs w:val="19"/>
               </w:rPr>
-              <w:t xml:space="preserve">Menyetujui / menolak barang keluar; melihat semua data</w:t>
+              <w:t xml:space="preserve">Memeriksa rincian kondisi, menyetujui / menolak barang keluar; melihat semua data</w:t>
             </w:r>
           </w:p>
         </w:tc>
@@ -939,7 +938,7 @@
                 <w:sz w:val="19"/>
                 <w:szCs w:val="19"/>
               </w:rPr>
-              <w:t xml:space="preserve">Mendaftarkan barang, mencatat barang masuk, mengajukan barang keluar</w:t>
+              <w:t xml:space="preserve">Mendaftarkan barang, mencatat barang masuk, mengajukan barang keluar (pinjam / pindah / musnahkan), mencatat pengembalian</w:t>
             </w:r>
           </w:p>
         </w:tc>
@@ -1062,7 +1061,6 @@
     <w:p>
       <w:pPr>
         <w:pStyle w:val="Heading1"/>
-        <w:keepNext/>
       </w:pPr>
       <w:r>
         <w:t xml:space="preserve">2. Hak Akses Ringkas</w:t>
@@ -1081,10 +1079,10 @@
         </w:tblBorders>
       </w:tblPr>
       <w:tblGrid>
-        <w:gridCol w:w="6087"/>
-        <w:gridCol w:w="1014"/>
-        <w:gridCol w:w="1352"/>
-        <w:gridCol w:w="1185"/>
+        <w:gridCol w:w="7139"/>
+        <w:gridCol w:w="713"/>
+        <w:gridCol w:w="951"/>
+        <w:gridCol w:w="835"/>
       </w:tblGrid>
       <w:tr>
         <w:trPr>
@@ -1092,7 +1090,7 @@
         </w:trPr>
         <w:tc>
           <w:tcPr>
-            <w:tcW w:type="dxa" w:w="6087"/>
+            <w:tcW w:type="dxa" w:w="7139"/>
             <w:tcBorders>
               <w:top w:val="single" w:color="BFBFBF" w:sz="4"/>
               <w:left w:val="single" w:color="BFBFBF" w:sz="4"/>
@@ -1122,7 +1120,7 @@
         </w:tc>
         <w:tc>
           <w:tcPr>
-            <w:tcW w:type="dxa" w:w="1014"/>
+            <w:tcW w:type="dxa" w:w="713"/>
             <w:tcBorders>
               <w:top w:val="single" w:color="BFBFBF" w:sz="4"/>
               <w:left w:val="single" w:color="BFBFBF" w:sz="4"/>
@@ -1152,7 +1150,7 @@
         </w:tc>
         <w:tc>
           <w:tcPr>
-            <w:tcW w:type="dxa" w:w="1352"/>
+            <w:tcW w:type="dxa" w:w="951"/>
             <w:tcBorders>
               <w:top w:val="single" w:color="BFBFBF" w:sz="4"/>
               <w:left w:val="single" w:color="BFBFBF" w:sz="4"/>
@@ -1182,7 +1180,7 @@
         </w:tc>
         <w:tc>
           <w:tcPr>
-            <w:tcW w:type="dxa" w:w="1185"/>
+            <w:tcW w:type="dxa" w:w="835"/>
             <w:tcBorders>
               <w:top w:val="single" w:color="BFBFBF" w:sz="4"/>
               <w:left w:val="single" w:color="BFBFBF" w:sz="4"/>
@@ -1217,7 +1215,7 @@
         </w:trPr>
         <w:tc>
           <w:tcPr>
-            <w:tcW w:type="dxa" w:w="6087"/>
+            <w:tcW w:type="dxa" w:w="7139"/>
             <w:tcBorders>
               <w:top w:val="single" w:color="BFBFBF" w:sz="4"/>
               <w:left w:val="single" w:color="BFBFBF" w:sz="4"/>
@@ -1243,7 +1241,7 @@
         </w:tc>
         <w:tc>
           <w:tcPr>
-            <w:tcW w:type="dxa" w:w="1014"/>
+            <w:tcW w:type="dxa" w:w="713"/>
             <w:tcBorders>
               <w:top w:val="single" w:color="BFBFBF" w:sz="4"/>
               <w:left w:val="single" w:color="BFBFBF" w:sz="4"/>
@@ -1269,7 +1267,7 @@
         </w:tc>
         <w:tc>
           <w:tcPr>
-            <w:tcW w:type="dxa" w:w="1352"/>
+            <w:tcW w:type="dxa" w:w="951"/>
             <w:tcBorders>
               <w:top w:val="single" w:color="BFBFBF" w:sz="4"/>
               <w:left w:val="single" w:color="BFBFBF" w:sz="4"/>
@@ -1295,7 +1293,7 @@
         </w:tc>
         <w:tc>
           <w:tcPr>
-            <w:tcW w:type="dxa" w:w="1185"/>
+            <w:tcW w:type="dxa" w:w="835"/>
             <w:tcBorders>
               <w:top w:val="single" w:color="BFBFBF" w:sz="4"/>
               <w:left w:val="single" w:color="BFBFBF" w:sz="4"/>
@@ -1326,33 +1324,33 @@
         </w:trPr>
         <w:tc>
           <w:tcPr>
-            <w:tcW w:type="dxa" w:w="6087"/>
-            <w:tcBorders>
-              <w:top w:val="single" w:color="BFBFBF" w:sz="4"/>
-              <w:left w:val="single" w:color="BFBFBF" w:sz="4"/>
-              <w:bottom w:val="single" w:color="BFBFBF" w:sz="4"/>
-              <w:right w:val="single" w:color="BFBFBF" w:sz="4"/>
-            </w:tcBorders>
-            <w:tcMar>
-              <w:top w:type="dxa" w:w="60"/>
-              <w:left w:type="dxa" w:w="100"/>
-              <w:bottom w:type="dxa" w:w="60"/>
-              <w:right w:type="dxa" w:w="100"/>
-            </w:tcMar>
-          </w:tcPr>
-          <w:p>
-            <w:r>
-              <w:rPr>
-                <w:sz w:val="19"/>
-                <w:szCs w:val="19"/>
-              </w:rPr>
-              <w:t xml:space="preserve">Pengguna, Kategori</w:t>
-            </w:r>
-          </w:p>
-        </w:tc>
-        <w:tc>
-          <w:tcPr>
-            <w:tcW w:type="dxa" w:w="1014"/>
+            <w:tcW w:type="dxa" w:w="7139"/>
+            <w:tcBorders>
+              <w:top w:val="single" w:color="BFBFBF" w:sz="4"/>
+              <w:left w:val="single" w:color="BFBFBF" w:sz="4"/>
+              <w:bottom w:val="single" w:color="BFBFBF" w:sz="4"/>
+              <w:right w:val="single" w:color="BFBFBF" w:sz="4"/>
+            </w:tcBorders>
+            <w:tcMar>
+              <w:top w:type="dxa" w:w="60"/>
+              <w:left w:type="dxa" w:w="100"/>
+              <w:bottom w:type="dxa" w:w="60"/>
+              <w:right w:type="dxa" w:w="100"/>
+            </w:tcMar>
+          </w:tcPr>
+          <w:p>
+            <w:r>
+              <w:rPr>
+                <w:sz w:val="19"/>
+                <w:szCs w:val="19"/>
+              </w:rPr>
+              <w:t xml:space="preserve">Pengguna, Kategori, Lokasi</w:t>
+            </w:r>
+          </w:p>
+        </w:tc>
+        <w:tc>
+          <w:tcPr>
+            <w:tcW w:type="dxa" w:w="713"/>
             <w:tcBorders>
               <w:top w:val="single" w:color="BFBFBF" w:sz="4"/>
               <w:left w:val="single" w:color="BFBFBF" w:sz="4"/>
@@ -1378,7 +1376,7 @@
         </w:tc>
         <w:tc>
           <w:tcPr>
-            <w:tcW w:type="dxa" w:w="1352"/>
+            <w:tcW w:type="dxa" w:w="951"/>
             <w:tcBorders>
               <w:top w:val="single" w:color="BFBFBF" w:sz="4"/>
               <w:left w:val="single" w:color="BFBFBF" w:sz="4"/>
@@ -1404,7 +1402,7 @@
         </w:tc>
         <w:tc>
           <w:tcPr>
-            <w:tcW w:type="dxa" w:w="1185"/>
+            <w:tcW w:type="dxa" w:w="835"/>
             <w:tcBorders>
               <w:top w:val="single" w:color="BFBFBF" w:sz="4"/>
               <w:left w:val="single" w:color="BFBFBF" w:sz="4"/>
@@ -1435,7 +1433,7 @@
         </w:trPr>
         <w:tc>
           <w:tcPr>
-            <w:tcW w:type="dxa" w:w="6087"/>
+            <w:tcW w:type="dxa" w:w="7139"/>
             <w:tcBorders>
               <w:top w:val="single" w:color="BFBFBF" w:sz="4"/>
               <w:left w:val="single" w:color="BFBFBF" w:sz="4"/>
@@ -1461,7 +1459,7 @@
         </w:tc>
         <w:tc>
           <w:tcPr>
-            <w:tcW w:type="dxa" w:w="1014"/>
+            <w:tcW w:type="dxa" w:w="713"/>
             <w:tcBorders>
               <w:top w:val="single" w:color="BFBFBF" w:sz="4"/>
               <w:left w:val="single" w:color="BFBFBF" w:sz="4"/>
@@ -1487,7 +1485,7 @@
         </w:tc>
         <w:tc>
           <w:tcPr>
-            <w:tcW w:type="dxa" w:w="1352"/>
+            <w:tcW w:type="dxa" w:w="951"/>
             <w:tcBorders>
               <w:top w:val="single" w:color="BFBFBF" w:sz="4"/>
               <w:left w:val="single" w:color="BFBFBF" w:sz="4"/>
@@ -1513,7 +1511,7 @@
         </w:tc>
         <w:tc>
           <w:tcPr>
-            <w:tcW w:type="dxa" w:w="1185"/>
+            <w:tcW w:type="dxa" w:w="835"/>
             <w:tcBorders>
               <w:top w:val="single" w:color="BFBFBF" w:sz="4"/>
               <w:left w:val="single" w:color="BFBFBF" w:sz="4"/>
@@ -1544,7 +1542,7 @@
         </w:trPr>
         <w:tc>
           <w:tcPr>
-            <w:tcW w:type="dxa" w:w="6087"/>
+            <w:tcW w:type="dxa" w:w="7139"/>
             <w:tcBorders>
               <w:top w:val="single" w:color="BFBFBF" w:sz="4"/>
               <w:left w:val="single" w:color="BFBFBF" w:sz="4"/>
@@ -1570,7 +1568,7 @@
         </w:tc>
         <w:tc>
           <w:tcPr>
-            <w:tcW w:type="dxa" w:w="1014"/>
+            <w:tcW w:type="dxa" w:w="713"/>
             <w:tcBorders>
               <w:top w:val="single" w:color="BFBFBF" w:sz="4"/>
               <w:left w:val="single" w:color="BFBFBF" w:sz="4"/>
@@ -1596,7 +1594,7 @@
         </w:tc>
         <w:tc>
           <w:tcPr>
-            <w:tcW w:type="dxa" w:w="1352"/>
+            <w:tcW w:type="dxa" w:w="951"/>
             <w:tcBorders>
               <w:top w:val="single" w:color="BFBFBF" w:sz="4"/>
               <w:left w:val="single" w:color="BFBFBF" w:sz="4"/>
@@ -1622,7 +1620,7 @@
         </w:tc>
         <w:tc>
           <w:tcPr>
-            <w:tcW w:type="dxa" w:w="1185"/>
+            <w:tcW w:type="dxa" w:w="835"/>
             <w:tcBorders>
               <w:top w:val="single" w:color="BFBFBF" w:sz="4"/>
               <w:left w:val="single" w:color="BFBFBF" w:sz="4"/>
@@ -1653,7 +1651,7 @@
         </w:trPr>
         <w:tc>
           <w:tcPr>
-            <w:tcW w:type="dxa" w:w="6087"/>
+            <w:tcW w:type="dxa" w:w="7139"/>
             <w:tcBorders>
               <w:top w:val="single" w:color="BFBFBF" w:sz="4"/>
               <w:left w:val="single" w:color="BFBFBF" w:sz="4"/>
@@ -1679,7 +1677,7 @@
         </w:tc>
         <w:tc>
           <w:tcPr>
-            <w:tcW w:type="dxa" w:w="1014"/>
+            <w:tcW w:type="dxa" w:w="713"/>
             <w:tcBorders>
               <w:top w:val="single" w:color="BFBFBF" w:sz="4"/>
               <w:left w:val="single" w:color="BFBFBF" w:sz="4"/>
@@ -1705,7 +1703,7 @@
         </w:tc>
         <w:tc>
           <w:tcPr>
-            <w:tcW w:type="dxa" w:w="1352"/>
+            <w:tcW w:type="dxa" w:w="951"/>
             <w:tcBorders>
               <w:top w:val="single" w:color="BFBFBF" w:sz="4"/>
               <w:left w:val="single" w:color="BFBFBF" w:sz="4"/>
@@ -1731,7 +1729,7 @@
         </w:tc>
         <w:tc>
           <w:tcPr>
-            <w:tcW w:type="dxa" w:w="1185"/>
+            <w:tcW w:type="dxa" w:w="835"/>
             <w:tcBorders>
               <w:top w:val="single" w:color="BFBFBF" w:sz="4"/>
               <w:left w:val="single" w:color="BFBFBF" w:sz="4"/>
@@ -1762,7 +1760,7 @@
         </w:trPr>
         <w:tc>
           <w:tcPr>
-            <w:tcW w:type="dxa" w:w="6087"/>
+            <w:tcW w:type="dxa" w:w="7139"/>
             <w:tcBorders>
               <w:top w:val="single" w:color="BFBFBF" w:sz="4"/>
               <w:left w:val="single" w:color="BFBFBF" w:sz="4"/>
@@ -1788,7 +1786,7 @@
         </w:tc>
         <w:tc>
           <w:tcPr>
-            <w:tcW w:type="dxa" w:w="1014"/>
+            <w:tcW w:type="dxa" w:w="713"/>
             <w:tcBorders>
               <w:top w:val="single" w:color="BFBFBF" w:sz="4"/>
               <w:left w:val="single" w:color="BFBFBF" w:sz="4"/>
@@ -1814,7 +1812,7 @@
         </w:tc>
         <w:tc>
           <w:tcPr>
-            <w:tcW w:type="dxa" w:w="1352"/>
+            <w:tcW w:type="dxa" w:w="951"/>
             <w:tcBorders>
               <w:top w:val="single" w:color="BFBFBF" w:sz="4"/>
               <w:left w:val="single" w:color="BFBFBF" w:sz="4"/>
@@ -1840,7 +1838,7 @@
         </w:tc>
         <w:tc>
           <w:tcPr>
-            <w:tcW w:type="dxa" w:w="1185"/>
+            <w:tcW w:type="dxa" w:w="835"/>
             <w:tcBorders>
               <w:top w:val="single" w:color="BFBFBF" w:sz="4"/>
               <w:left w:val="single" w:color="BFBFBF" w:sz="4"/>
@@ -1871,7 +1869,7 @@
         </w:trPr>
         <w:tc>
           <w:tcPr>
-            <w:tcW w:type="dxa" w:w="6087"/>
+            <w:tcW w:type="dxa" w:w="7139"/>
             <w:tcBorders>
               <w:top w:val="single" w:color="BFBFBF" w:sz="4"/>
               <w:left w:val="single" w:color="BFBFBF" w:sz="4"/>
@@ -1897,7 +1895,7 @@
         </w:tc>
         <w:tc>
           <w:tcPr>
-            <w:tcW w:type="dxa" w:w="1014"/>
+            <w:tcW w:type="dxa" w:w="713"/>
             <w:tcBorders>
               <w:top w:val="single" w:color="BFBFBF" w:sz="4"/>
               <w:left w:val="single" w:color="BFBFBF" w:sz="4"/>
@@ -1923,7 +1921,7 @@
         </w:tc>
         <w:tc>
           <w:tcPr>
-            <w:tcW w:type="dxa" w:w="1352"/>
+            <w:tcW w:type="dxa" w:w="951"/>
             <w:tcBorders>
               <w:top w:val="single" w:color="BFBFBF" w:sz="4"/>
               <w:left w:val="single" w:color="BFBFBF" w:sz="4"/>
@@ -1949,7 +1947,7 @@
         </w:tc>
         <w:tc>
           <w:tcPr>
-            <w:tcW w:type="dxa" w:w="1185"/>
+            <w:tcW w:type="dxa" w:w="835"/>
             <w:tcBorders>
               <w:top w:val="single" w:color="BFBFBF" w:sz="4"/>
               <w:left w:val="single" w:color="BFBFBF" w:sz="4"/>
@@ -1980,33 +1978,33 @@
         </w:trPr>
         <w:tc>
           <w:tcPr>
-            <w:tcW w:type="dxa" w:w="6087"/>
-            <w:tcBorders>
-              <w:top w:val="single" w:color="BFBFBF" w:sz="4"/>
-              <w:left w:val="single" w:color="BFBFBF" w:sz="4"/>
-              <w:bottom w:val="single" w:color="BFBFBF" w:sz="4"/>
-              <w:right w:val="single" w:color="BFBFBF" w:sz="4"/>
-            </w:tcBorders>
-            <w:tcMar>
-              <w:top w:type="dxa" w:w="60"/>
-              <w:left w:type="dxa" w:w="100"/>
-              <w:bottom w:type="dxa" w:w="60"/>
-              <w:right w:type="dxa" w:w="100"/>
-            </w:tcMar>
-          </w:tcPr>
-          <w:p>
-            <w:r>
-              <w:rPr>
-                <w:sz w:val="19"/>
-                <w:szCs w:val="19"/>
-              </w:rPr>
-              <w:t xml:space="preserve">Barang Keluar — ajukan (foto wajib)</w:t>
-            </w:r>
-          </w:p>
-        </w:tc>
-        <w:tc>
-          <w:tcPr>
-            <w:tcW w:type="dxa" w:w="1014"/>
+            <w:tcW w:type="dxa" w:w="7139"/>
+            <w:tcBorders>
+              <w:top w:val="single" w:color="BFBFBF" w:sz="4"/>
+              <w:left w:val="single" w:color="BFBFBF" w:sz="4"/>
+              <w:bottom w:val="single" w:color="BFBFBF" w:sz="4"/>
+              <w:right w:val="single" w:color="BFBFBF" w:sz="4"/>
+            </w:tcBorders>
+            <w:tcMar>
+              <w:top w:type="dxa" w:w="60"/>
+              <w:left w:type="dxa" w:w="100"/>
+              <w:bottom w:type="dxa" w:w="60"/>
+              <w:right w:type="dxa" w:w="100"/>
+            </w:tcMar>
+          </w:tcPr>
+          <w:p>
+            <w:r>
+              <w:rPr>
+                <w:sz w:val="19"/>
+                <w:szCs w:val="19"/>
+              </w:rPr>
+              <w:t xml:space="preserve">Barang Keluar — ajukan Peminjaman / Pemindahan / Pemusnahan (foto wajib)</w:t>
+            </w:r>
+          </w:p>
+        </w:tc>
+        <w:tc>
+          <w:tcPr>
+            <w:tcW w:type="dxa" w:w="713"/>
             <w:tcBorders>
               <w:top w:val="single" w:color="BFBFBF" w:sz="4"/>
               <w:left w:val="single" w:color="BFBFBF" w:sz="4"/>
@@ -2032,7 +2030,7 @@
         </w:tc>
         <w:tc>
           <w:tcPr>
-            <w:tcW w:type="dxa" w:w="1352"/>
+            <w:tcW w:type="dxa" w:w="951"/>
             <w:tcBorders>
               <w:top w:val="single" w:color="BFBFBF" w:sz="4"/>
               <w:left w:val="single" w:color="BFBFBF" w:sz="4"/>
@@ -2058,7 +2056,7 @@
         </w:tc>
         <w:tc>
           <w:tcPr>
-            <w:tcW w:type="dxa" w:w="1185"/>
+            <w:tcW w:type="dxa" w:w="835"/>
             <w:tcBorders>
               <w:top w:val="single" w:color="BFBFBF" w:sz="4"/>
               <w:left w:val="single" w:color="BFBFBF" w:sz="4"/>
@@ -2089,33 +2087,33 @@
         </w:trPr>
         <w:tc>
           <w:tcPr>
-            <w:tcW w:type="dxa" w:w="6087"/>
-            <w:tcBorders>
-              <w:top w:val="single" w:color="BFBFBF" w:sz="4"/>
-              <w:left w:val="single" w:color="BFBFBF" w:sz="4"/>
-              <w:bottom w:val="single" w:color="BFBFBF" w:sz="4"/>
-              <w:right w:val="single" w:color="BFBFBF" w:sz="4"/>
-            </w:tcBorders>
-            <w:tcMar>
-              <w:top w:type="dxa" w:w="60"/>
-              <w:left w:type="dxa" w:w="100"/>
-              <w:bottom w:type="dxa" w:w="60"/>
-              <w:right w:type="dxa" w:w="100"/>
-            </w:tcMar>
-          </w:tcPr>
-          <w:p>
-            <w:r>
-              <w:rPr>
-                <w:sz w:val="19"/>
-                <w:szCs w:val="19"/>
-              </w:rPr>
-              <w:t xml:space="preserve">Barang Keluar — Setujui / Tolak</w:t>
-            </w:r>
-          </w:p>
-        </w:tc>
-        <w:tc>
-          <w:tcPr>
-            <w:tcW w:type="dxa" w:w="1014"/>
+            <w:tcW w:type="dxa" w:w="7139"/>
+            <w:tcBorders>
+              <w:top w:val="single" w:color="BFBFBF" w:sz="4"/>
+              <w:left w:val="single" w:color="BFBFBF" w:sz="4"/>
+              <w:bottom w:val="single" w:color="BFBFBF" w:sz="4"/>
+              <w:right w:val="single" w:color="BFBFBF" w:sz="4"/>
+            </w:tcBorders>
+            <w:tcMar>
+              <w:top w:type="dxa" w:w="60"/>
+              <w:left w:type="dxa" w:w="100"/>
+              <w:bottom w:type="dxa" w:w="60"/>
+              <w:right w:type="dxa" w:w="100"/>
+            </w:tcMar>
+          </w:tcPr>
+          <w:p>
+            <w:r>
+              <w:rPr>
+                <w:sz w:val="19"/>
+                <w:szCs w:val="19"/>
+              </w:rPr>
+              <w:t xml:space="preserve">Barang Keluar — periksa / koreksi rincian kondisi, Setujui / Tolak</w:t>
+            </w:r>
+          </w:p>
+        </w:tc>
+        <w:tc>
+          <w:tcPr>
+            <w:tcW w:type="dxa" w:w="713"/>
             <w:tcBorders>
               <w:top w:val="single" w:color="BFBFBF" w:sz="4"/>
               <w:left w:val="single" w:color="BFBFBF" w:sz="4"/>
@@ -2141,7 +2139,7 @@
         </w:tc>
         <w:tc>
           <w:tcPr>
-            <w:tcW w:type="dxa" w:w="1352"/>
+            <w:tcW w:type="dxa" w:w="951"/>
             <w:tcBorders>
               <w:top w:val="single" w:color="BFBFBF" w:sz="4"/>
               <w:left w:val="single" w:color="BFBFBF" w:sz="4"/>
@@ -2167,7 +2165,225 @@
         </w:tc>
         <w:tc>
           <w:tcPr>
-            <w:tcW w:type="dxa" w:w="1185"/>
+            <w:tcW w:type="dxa" w:w="835"/>
+            <w:tcBorders>
+              <w:top w:val="single" w:color="BFBFBF" w:sz="4"/>
+              <w:left w:val="single" w:color="BFBFBF" w:sz="4"/>
+              <w:bottom w:val="single" w:color="BFBFBF" w:sz="4"/>
+              <w:right w:val="single" w:color="BFBFBF" w:sz="4"/>
+            </w:tcBorders>
+            <w:tcMar>
+              <w:top w:type="dxa" w:w="60"/>
+              <w:left w:type="dxa" w:w="100"/>
+              <w:bottom w:type="dxa" w:w="60"/>
+              <w:right w:type="dxa" w:w="100"/>
+            </w:tcMar>
+          </w:tcPr>
+          <w:p>
+            <w:r>
+              <w:rPr>
+                <w:sz w:val="19"/>
+                <w:szCs w:val="19"/>
+              </w:rPr>
+              <w:t xml:space="preserve">Ya</w:t>
+            </w:r>
+          </w:p>
+        </w:tc>
+      </w:tr>
+      <w:tr>
+        <w:trPr>
+          <w:tblHeader w:val="off"/>
+        </w:trPr>
+        <w:tc>
+          <w:tcPr>
+            <w:tcW w:type="dxa" w:w="7139"/>
+            <w:tcBorders>
+              <w:top w:val="single" w:color="BFBFBF" w:sz="4"/>
+              <w:left w:val="single" w:color="BFBFBF" w:sz="4"/>
+              <w:bottom w:val="single" w:color="BFBFBF" w:sz="4"/>
+              <w:right w:val="single" w:color="BFBFBF" w:sz="4"/>
+            </w:tcBorders>
+            <w:tcMar>
+              <w:top w:type="dxa" w:w="60"/>
+              <w:left w:type="dxa" w:w="100"/>
+              <w:bottom w:type="dxa" w:w="60"/>
+              <w:right w:type="dxa" w:w="100"/>
+            </w:tcMar>
+          </w:tcPr>
+          <w:p>
+            <w:r>
+              <w:rPr>
+                <w:sz w:val="19"/>
+                <w:szCs w:val="19"/>
+              </w:rPr>
+              <w:t xml:space="preserve">Pengembalian barang pinjaman — catat</w:t>
+            </w:r>
+          </w:p>
+        </w:tc>
+        <w:tc>
+          <w:tcPr>
+            <w:tcW w:type="dxa" w:w="713"/>
+            <w:tcBorders>
+              <w:top w:val="single" w:color="BFBFBF" w:sz="4"/>
+              <w:left w:val="single" w:color="BFBFBF" w:sz="4"/>
+              <w:bottom w:val="single" w:color="BFBFBF" w:sz="4"/>
+              <w:right w:val="single" w:color="BFBFBF" w:sz="4"/>
+            </w:tcBorders>
+            <w:tcMar>
+              <w:top w:type="dxa" w:w="60"/>
+              <w:left w:type="dxa" w:w="100"/>
+              <w:bottom w:type="dxa" w:w="60"/>
+              <w:right w:type="dxa" w:w="100"/>
+            </w:tcMar>
+          </w:tcPr>
+          <w:p>
+            <w:r>
+              <w:rPr>
+                <w:sz w:val="19"/>
+                <w:szCs w:val="19"/>
+              </w:rPr>
+              <w:t xml:space="preserve">Tidak</w:t>
+            </w:r>
+          </w:p>
+        </w:tc>
+        <w:tc>
+          <w:tcPr>
+            <w:tcW w:type="dxa" w:w="951"/>
+            <w:tcBorders>
+              <w:top w:val="single" w:color="BFBFBF" w:sz="4"/>
+              <w:left w:val="single" w:color="BFBFBF" w:sz="4"/>
+              <w:bottom w:val="single" w:color="BFBFBF" w:sz="4"/>
+              <w:right w:val="single" w:color="BFBFBF" w:sz="4"/>
+            </w:tcBorders>
+            <w:tcMar>
+              <w:top w:type="dxa" w:w="60"/>
+              <w:left w:type="dxa" w:w="100"/>
+              <w:bottom w:type="dxa" w:w="60"/>
+              <w:right w:type="dxa" w:w="100"/>
+            </w:tcMar>
+          </w:tcPr>
+          <w:p>
+            <w:r>
+              <w:rPr>
+                <w:sz w:val="19"/>
+                <w:szCs w:val="19"/>
+              </w:rPr>
+              <w:t xml:space="preserve">Ya</w:t>
+            </w:r>
+          </w:p>
+        </w:tc>
+        <w:tc>
+          <w:tcPr>
+            <w:tcW w:type="dxa" w:w="835"/>
+            <w:tcBorders>
+              <w:top w:val="single" w:color="BFBFBF" w:sz="4"/>
+              <w:left w:val="single" w:color="BFBFBF" w:sz="4"/>
+              <w:bottom w:val="single" w:color="BFBFBF" w:sz="4"/>
+              <w:right w:val="single" w:color="BFBFBF" w:sz="4"/>
+            </w:tcBorders>
+            <w:tcMar>
+              <w:top w:type="dxa" w:w="60"/>
+              <w:left w:type="dxa" w:w="100"/>
+              <w:bottom w:type="dxa" w:w="60"/>
+              <w:right w:type="dxa" w:w="100"/>
+            </w:tcMar>
+          </w:tcPr>
+          <w:p>
+            <w:r>
+              <w:rPr>
+                <w:sz w:val="19"/>
+                <w:szCs w:val="19"/>
+              </w:rPr>
+              <w:t xml:space="preserve">Tidak</w:t>
+            </w:r>
+          </w:p>
+        </w:tc>
+      </w:tr>
+      <w:tr>
+        <w:trPr>
+          <w:tblHeader w:val="off"/>
+        </w:trPr>
+        <w:tc>
+          <w:tcPr>
+            <w:tcW w:type="dxa" w:w="7139"/>
+            <w:tcBorders>
+              <w:top w:val="single" w:color="BFBFBF" w:sz="4"/>
+              <w:left w:val="single" w:color="BFBFBF" w:sz="4"/>
+              <w:bottom w:val="single" w:color="BFBFBF" w:sz="4"/>
+              <w:right w:val="single" w:color="BFBFBF" w:sz="4"/>
+            </w:tcBorders>
+            <w:tcMar>
+              <w:top w:type="dxa" w:w="60"/>
+              <w:left w:type="dxa" w:w="100"/>
+              <w:bottom w:type="dxa" w:w="60"/>
+              <w:right w:type="dxa" w:w="100"/>
+            </w:tcMar>
+          </w:tcPr>
+          <w:p>
+            <w:r>
+              <w:rPr>
+                <w:sz w:val="19"/>
+                <w:szCs w:val="19"/>
+              </w:rPr>
+              <w:t xml:space="preserve">Barang masuk / keluar / pengembalian — lihat, cetak</w:t>
+            </w:r>
+          </w:p>
+        </w:tc>
+        <w:tc>
+          <w:tcPr>
+            <w:tcW w:type="dxa" w:w="713"/>
+            <w:tcBorders>
+              <w:top w:val="single" w:color="BFBFBF" w:sz="4"/>
+              <w:left w:val="single" w:color="BFBFBF" w:sz="4"/>
+              <w:bottom w:val="single" w:color="BFBFBF" w:sz="4"/>
+              <w:right w:val="single" w:color="BFBFBF" w:sz="4"/>
+            </w:tcBorders>
+            <w:tcMar>
+              <w:top w:type="dxa" w:w="60"/>
+              <w:left w:type="dxa" w:w="100"/>
+              <w:bottom w:type="dxa" w:w="60"/>
+              <w:right w:type="dxa" w:w="100"/>
+            </w:tcMar>
+          </w:tcPr>
+          <w:p>
+            <w:r>
+              <w:rPr>
+                <w:sz w:val="19"/>
+                <w:szCs w:val="19"/>
+              </w:rPr>
+              <w:t xml:space="preserve">Ya</w:t>
+            </w:r>
+          </w:p>
+        </w:tc>
+        <w:tc>
+          <w:tcPr>
+            <w:tcW w:type="dxa" w:w="951"/>
+            <w:tcBorders>
+              <w:top w:val="single" w:color="BFBFBF" w:sz="4"/>
+              <w:left w:val="single" w:color="BFBFBF" w:sz="4"/>
+              <w:bottom w:val="single" w:color="BFBFBF" w:sz="4"/>
+              <w:right w:val="single" w:color="BFBFBF" w:sz="4"/>
+            </w:tcBorders>
+            <w:tcMar>
+              <w:top w:type="dxa" w:w="60"/>
+              <w:left w:type="dxa" w:w="100"/>
+              <w:bottom w:type="dxa" w:w="60"/>
+              <w:right w:type="dxa" w:w="100"/>
+            </w:tcMar>
+          </w:tcPr>
+          <w:p>
+            <w:r>
+              <w:rPr>
+                <w:sz w:val="19"/>
+                <w:szCs w:val="19"/>
+              </w:rPr>
+              <w:t xml:space="preserve">Ya</w:t>
+            </w:r>
+          </w:p>
+        </w:tc>
+        <w:tc>
+          <w:tcPr>
+            <w:tcW w:type="dxa" w:w="835"/>
             <w:tcBorders>
               <w:top w:val="single" w:color="BFBFBF" w:sz="4"/>
               <w:left w:val="single" w:color="BFBFBF" w:sz="4"/>
@@ -2201,7 +2417,6 @@
     <w:p>
       <w:pPr>
         <w:pStyle w:val="Heading1"/>
-        <w:keepNext/>
       </w:pPr>
       <w:r>
         <w:t xml:space="preserve">3. Mengganti Password</w:t>
@@ -2300,7 +2515,6 @@
     <w:p>
       <w:pPr>
         <w:pStyle w:val="Heading1"/>
-        <w:keepNext/>
       </w:pPr>
       <w:r>
         <w:t xml:space="preserve">4. Mengembalikan Akun ke Kondisi Awal</w:t>
@@ -2371,7 +2585,6 @@
     <w:p>
       <w:pPr>
         <w:pStyle w:val="Heading1"/>
-        <w:keepNext/>
       </w:pPr>
       <w:r>
         <w:t xml:space="preserve">5. Data Rahasia Lainnya (bukan untuk dibagikan)</w:t>

</xml_diff>